<commit_message>
feat: breaker_min_rating for panels + ТЕСТ full selectivity fix
- calc/engine.py: added breaker_min_rating panel field — engine honors
  engineer-specified minimum AB rating (e.g. for selectivity constraints)
  by re-selecting if auto-selected rating is below the minimum
- ТЕСТ project: set breaker_min_rating=10 on ЩАО-1 and ЩОВ-1,
  breaker_min_rating=16 on ЩАПЗ-1 → zero selectivity violations
- CLAUDE.md: document breaker_min_rating field, update ТЕСТ expected
  values with panel AB ratings and zero violation status
- README: updated test objects table

https://claude.ai/code/session_01EUXh9NoaZ7HpixNuaMKahR
</commit_message>
<xml_diff>
--- a/elec-system/projects/ТЕСТ-2025-001_Тестовая_школа/docs/load_summary.docx
+++ b/elec-system/projects/ТЕСТ-2025-001_Тестовая_школа/docs/load_summary.docx
@@ -259,6 +259,36 @@
                 <w:b w:val="0"/>
                 <w:sz w:val="16"/>
               </w:rPr>
+              <w:t>КРМ</w:t>
+            </w:r>
+          </w:p>
+        </w:tc>
+        <w:tc>
+          <w:tcPr>
+            <w:tcW w:type="dxa" w:w="4320"/>
+          </w:tcPr>
+          <w:p>
+            <w:r>
+              <w:rPr>
+                <w:b w:val="0"/>
+                <w:sz w:val="16"/>
+              </w:rPr>
+              <w:t>КРМ-0.4-10 (10 кВАр)</w:t>
+            </w:r>
+          </w:p>
+        </w:tc>
+      </w:tr>
+      <w:tr>
+        <w:tc>
+          <w:tcPr>
+            <w:tcW w:type="dxa" w:w="4320"/>
+          </w:tcPr>
+          <w:p>
+            <w:r>
+              <w:rPr>
+                <w:b w:val="0"/>
+                <w:sz w:val="16"/>
+              </w:rPr>
             </w:r>
           </w:p>
         </w:tc>
@@ -331,7 +361,7 @@
                 <w:b w:val="0"/>
                 <w:sz w:val="16"/>
               </w:rPr>
-              <w:t>3 линий</w:t>
+              <w:t>4 линий</w:t>
             </w:r>
           </w:p>
         </w:tc>

</xml_diff>